<commit_message>
Add submission links and team contact
</commit_message>
<xml_diff>
--- a/submission_materials/THUYET_MINH_SAN_PHAM_VIFINQA.docx
+++ b/submission_materials/THUYET_MINH_SAN_PHAM_VIFINQA.docx
@@ -1339,7 +1339,7 @@
                 <w:i w:val="0"/>
                 <w:sz w:val="19"/>
               </w:rPr>
-              <w:t>[LINK GOOGLE DRIVE/ONEDRIVE]</w:t>
+              <w:t>https://huggingface.co/datasets/AIGuruTinix/ViFinQA</w:t>
             </w:r>
           </w:p>
         </w:tc>
@@ -1924,7 +1924,7 @@
           <w:i w:val="0"/>
           <w:sz w:val="22"/>
         </w:rPr>
-        <w:t>Link mã nguồn: [ĐIỀN LINK GITHUB/DRIVE].</w:t>
+        <w:t>Link mã nguồn: https://github.com/Viendeptrai1/lastdance-vifinqa.</w:t>
       </w:r>
     </w:p>
     <w:tbl>
@@ -2600,7 +2600,7 @@
                 <w:i w:val="0"/>
                 <w:sz w:val="19"/>
               </w:rPr>
-              <w:t>[ĐIỀN HỌ TÊN]</w:t>
+              <w:t>Phan Quốc Viễn</w:t>
             </w:r>
           </w:p>
         </w:tc>
@@ -2708,7 +2708,7 @@
                 <w:i w:val="0"/>
                 <w:sz w:val="19"/>
               </w:rPr>
-              <w:t>[ĐIỀN SỐ ĐIỆN THOẠI]</w:t>
+              <w:t>0914426099</w:t>
             </w:r>
           </w:p>
         </w:tc>

</xml_diff>